<commit_message>
feat: add automation script to merge functional design markdown files and convert to styled Word documents
</commit_message>
<xml_diff>
--- a/docs/achievement/2_功能设计-系统管理.docx
+++ b/docs/achievement/2_功能设计-系统管理.docx
@@ -884,7 +884,7 @@
               <a:graphicData uri="http://schemas.openxmlformats.org/drawingml/2006/picture">
                 <pic:pic>
                   <pic:nvPicPr>
-                    <pic:cNvPr descr="../assets/flow_用户管理.png" id="13" name="Picture"/>
+                    <pic:cNvPr descr="../assets/系统管理/flow_用户管理.png" id="13" name="Picture"/>
                     <pic:cNvPicPr>
                       <a:picLocks noChangeArrowheads="1" noChangeAspect="1"/>
                     </pic:cNvPicPr>
@@ -1098,7 +1098,7 @@
               <a:graphicData uri="http://schemas.openxmlformats.org/drawingml/2006/picture">
                 <pic:pic>
                   <pic:nvPicPr>
-                    <pic:cNvPr descr="../assets/user_management.png" id="18" name="Picture"/>
+                    <pic:cNvPr descr="../assets/系统管理/user_management.png" id="18" name="Picture"/>
                     <pic:cNvPicPr>
                       <a:picLocks noChangeArrowheads="1" noChangeAspect="1"/>
                     </pic:cNvPicPr>
@@ -3403,7 +3403,7 @@
               <a:graphicData uri="http://schemas.openxmlformats.org/drawingml/2006/picture">
                 <pic:pic>
                   <pic:nvPicPr>
-                    <pic:cNvPr descr="../assets/user_add_modal.png" id="22" name="Picture"/>
+                    <pic:cNvPr descr="../assets/系统管理/user_add_modal.png" id="22" name="Picture"/>
                     <pic:cNvPicPr>
                       <a:picLocks noChangeArrowheads="1" noChangeAspect="1"/>
                     </pic:cNvPicPr>
@@ -5030,7 +5030,7 @@
               <a:graphicData uri="http://schemas.openxmlformats.org/drawingml/2006/picture">
                 <pic:pic>
                   <pic:nvPicPr>
-                    <pic:cNvPr descr="../assets/user_edit_modal.png" id="26" name="Picture"/>
+                    <pic:cNvPr descr="../assets/系统管理/user_edit_modal.png" id="26" name="Picture"/>
                     <pic:cNvPicPr>
                       <a:picLocks noChangeArrowheads="1" noChangeAspect="1"/>
                     </pic:cNvPicPr>
@@ -6447,7 +6447,7 @@
               <a:graphicData uri="http://schemas.openxmlformats.org/drawingml/2006/picture">
                 <pic:pic>
                   <pic:nvPicPr>
-                    <pic:cNvPr descr="../assets/user_reset_pwd_modal.png" id="30" name="Picture"/>
+                    <pic:cNvPr descr="../assets/系统管理/user_reset_pwd_modal.png" id="30" name="Picture"/>
                     <pic:cNvPicPr>
                       <a:picLocks noChangeArrowheads="1" noChangeAspect="1"/>
                     </pic:cNvPicPr>
@@ -7676,7 +7676,7 @@
               <a:graphicData uri="http://schemas.openxmlformats.org/drawingml/2006/picture">
                 <pic:pic>
                   <pic:nvPicPr>
-                    <pic:cNvPr descr="../assets/user_assign_role_drawer.png" id="35" name="Picture"/>
+                    <pic:cNvPr descr="../assets/系统管理/user_assign_role_drawer.png" id="35" name="Picture"/>
                     <pic:cNvPicPr>
                       <a:picLocks noChangeArrowheads="1" noChangeAspect="1"/>
                     </pic:cNvPicPr>
@@ -8576,7 +8576,7 @@
               <a:graphicData uri="http://schemas.openxmlformats.org/drawingml/2006/picture">
                 <pic:pic>
                   <pic:nvPicPr>
-                    <pic:cNvPr descr="../assets/flow_角色管理.png" id="41" name="Picture"/>
+                    <pic:cNvPr descr="../assets/系统管理/flow_角色管理.png" id="41" name="Picture"/>
                     <pic:cNvPicPr>
                       <a:picLocks noChangeArrowheads="1" noChangeAspect="1"/>
                     </pic:cNvPicPr>
@@ -8766,7 +8766,7 @@
               <a:graphicData uri="http://schemas.openxmlformats.org/drawingml/2006/picture">
                 <pic:pic>
                   <pic:nvPicPr>
-                    <pic:cNvPr descr="../assets/role_management_main.png" id="46" name="Picture"/>
+                    <pic:cNvPr descr="../assets/系统管理/role_management_main.png" id="46" name="Picture"/>
                     <pic:cNvPicPr>
                       <a:picLocks noChangeArrowheads="1" noChangeAspect="1"/>
                     </pic:cNvPicPr>
@@ -10904,7 +10904,7 @@
               <a:graphicData uri="http://schemas.openxmlformats.org/drawingml/2006/picture">
                 <pic:pic>
                   <pic:nvPicPr>
-                    <pic:cNvPr descr="../assets/role_add_modal.png" id="50" name="Picture"/>
+                    <pic:cNvPr descr="../assets/系统管理/role_add_modal.png" id="50" name="Picture"/>
                     <pic:cNvPicPr>
                       <a:picLocks noChangeArrowheads="1" noChangeAspect="1"/>
                     </pic:cNvPicPr>
@@ -12505,7 +12505,7 @@
               <a:graphicData uri="http://schemas.openxmlformats.org/drawingml/2006/picture">
                 <pic:pic>
                   <pic:nvPicPr>
-                    <pic:cNvPr descr="../assets/role_data_scope_modal.png" id="54" name="Picture"/>
+                    <pic:cNvPr descr="../assets/系统管理/role_data_scope_modal.png" id="54" name="Picture"/>
                     <pic:cNvPicPr>
                       <a:picLocks noChangeArrowheads="1" noChangeAspect="1"/>
                     </pic:cNvPicPr>
@@ -13577,7 +13577,7 @@
               <a:graphicData uri="http://schemas.openxmlformats.org/drawingml/2006/picture">
                 <pic:pic>
                   <pic:nvPicPr>
-                    <pic:cNvPr descr="../assets/role_assign_user_page.png" id="58" name="Picture"/>
+                    <pic:cNvPr descr="../assets/系统管理/role_assign_user_page.png" id="58" name="Picture"/>
                     <pic:cNvPicPr>
                       <a:picLocks noChangeArrowheads="1" noChangeAspect="1"/>
                     </pic:cNvPicPr>
@@ -14944,7 +14944,7 @@
               <a:graphicData uri="http://schemas.openxmlformats.org/drawingml/2006/picture">
                 <pic:pic>
                   <pic:nvPicPr>
-                    <pic:cNvPr descr="../assets/flow_菜单管理.png" id="64" name="Picture"/>
+                    <pic:cNvPr descr="../assets/系统管理/flow_菜单管理.png" id="64" name="Picture"/>
                     <pic:cNvPicPr>
                       <a:picLocks noChangeArrowheads="1" noChangeAspect="1"/>
                     </pic:cNvPicPr>
@@ -15119,7 +15119,7 @@
               <a:graphicData uri="http://schemas.openxmlformats.org/drawingml/2006/picture">
                 <pic:pic>
                   <pic:nvPicPr>
-                    <pic:cNvPr descr="../assets/menu_management_main.png" id="69" name="Picture"/>
+                    <pic:cNvPr descr="../assets/系统管理/menu_management_main.png" id="69" name="Picture"/>
                     <pic:cNvPicPr>
                       <a:picLocks noChangeArrowheads="1" noChangeAspect="1"/>
                     </pic:cNvPicPr>
@@ -16909,7 +16909,7 @@
               <a:graphicData uri="http://schemas.openxmlformats.org/drawingml/2006/picture">
                 <pic:pic>
                   <pic:nvPicPr>
-                    <pic:cNvPr descr="../assets/menu_add_modal.png" id="73" name="Picture"/>
+                    <pic:cNvPr descr="../assets/系统管理/menu_add_modal.png" id="73" name="Picture"/>
                     <pic:cNvPicPr>
                       <a:picLocks noChangeArrowheads="1" noChangeAspect="1"/>
                     </pic:cNvPicPr>
@@ -19423,7 +19423,7 @@
               <a:graphicData uri="http://schemas.openxmlformats.org/drawingml/2006/picture">
                 <pic:pic>
                   <pic:nvPicPr>
-                    <pic:cNvPr descr="../assets/flow_部门管理.png" id="79" name="Picture"/>
+                    <pic:cNvPr descr="../assets/系统管理/flow_部门管理.png" id="79" name="Picture"/>
                     <pic:cNvPicPr>
                       <a:picLocks noChangeArrowheads="1" noChangeAspect="1"/>
                     </pic:cNvPicPr>
@@ -19613,7 +19613,7 @@
               <a:graphicData uri="http://schemas.openxmlformats.org/drawingml/2006/picture">
                 <pic:pic>
                   <pic:nvPicPr>
-                    <pic:cNvPr descr="../assets/dept_management_main.png" id="84" name="Picture"/>
+                    <pic:cNvPr descr="../assets/系统管理/dept_management_main.png" id="84" name="Picture"/>
                     <pic:cNvPicPr>
                       <a:picLocks noChangeArrowheads="1" noChangeAspect="1"/>
                     </pic:cNvPicPr>
@@ -21118,7 +21118,7 @@
               <a:graphicData uri="http://schemas.openxmlformats.org/drawingml/2006/picture">
                 <pic:pic>
                   <pic:nvPicPr>
-                    <pic:cNvPr descr="../assets/dept_add_modal.png" id="88" name="Picture"/>
+                    <pic:cNvPr descr="../assets/系统管理/dept_add_modal.png" id="88" name="Picture"/>
                     <pic:cNvPicPr>
                       <a:picLocks noChangeArrowheads="1" noChangeAspect="1"/>
                     </pic:cNvPicPr>
@@ -22904,7 +22904,7 @@
               <a:graphicData uri="http://schemas.openxmlformats.org/drawingml/2006/picture">
                 <pic:pic>
                   <pic:nvPicPr>
-                    <pic:cNvPr descr="../assets/flow_岗位管理.png" id="94" name="Picture"/>
+                    <pic:cNvPr descr="../assets/系统管理/flow_岗位管理.png" id="94" name="Picture"/>
                     <pic:cNvPicPr>
                       <a:picLocks noChangeArrowheads="1" noChangeAspect="1"/>
                     </pic:cNvPicPr>
@@ -23094,7 +23094,7 @@
               <a:graphicData uri="http://schemas.openxmlformats.org/drawingml/2006/picture">
                 <pic:pic>
                   <pic:nvPicPr>
-                    <pic:cNvPr descr="../assets/post_management_main.png" id="99" name="Picture"/>
+                    <pic:cNvPr descr="../assets/系统管理/post_management_main.png" id="99" name="Picture"/>
                     <pic:cNvPicPr>
                       <a:picLocks noChangeArrowheads="1" noChangeAspect="1"/>
                     </pic:cNvPicPr>
@@ -24886,7 +24886,7 @@
               <a:graphicData uri="http://schemas.openxmlformats.org/drawingml/2006/picture">
                 <pic:pic>
                   <pic:nvPicPr>
-                    <pic:cNvPr descr="../assets/post_add_modal.png" id="103" name="Picture"/>
+                    <pic:cNvPr descr="../assets/系统管理/post_add_modal.png" id="103" name="Picture"/>
                     <pic:cNvPicPr>
                       <a:picLocks noChangeArrowheads="1" noChangeAspect="1"/>
                     </pic:cNvPicPr>
@@ -26371,7 +26371,7 @@
               <a:graphicData uri="http://schemas.openxmlformats.org/drawingml/2006/picture">
                 <pic:pic>
                   <pic:nvPicPr>
-                    <pic:cNvPr descr="../assets/flow_字典管理.png" id="109" name="Picture"/>
+                    <pic:cNvPr descr="../assets/系统管理/flow_字典管理.png" id="109" name="Picture"/>
                     <pic:cNvPicPr>
                       <a:picLocks noChangeArrowheads="1" noChangeAspect="1"/>
                     </pic:cNvPicPr>
@@ -26564,7 +26564,7 @@
               <a:graphicData uri="http://schemas.openxmlformats.org/drawingml/2006/picture">
                 <pic:pic>
                   <pic:nvPicPr>
-                    <pic:cNvPr descr="../assets/dict_type_main.png" id="114" name="Picture"/>
+                    <pic:cNvPr descr="../assets/系统管理/dict_type_main.png" id="114" name="Picture"/>
                     <pic:cNvPicPr>
                       <a:picLocks noChangeArrowheads="1" noChangeAspect="1"/>
                     </pic:cNvPicPr>
@@ -27956,7 +27956,7 @@
               <a:graphicData uri="http://schemas.openxmlformats.org/drawingml/2006/picture">
                 <pic:pic>
                   <pic:nvPicPr>
-                    <pic:cNvPr descr="../assets/dict_type_add_modal.png" id="118" name="Picture"/>
+                    <pic:cNvPr descr="../assets/系统管理/dict_type_add_modal.png" id="118" name="Picture"/>
                     <pic:cNvPicPr>
                       <a:picLocks noChangeArrowheads="1" noChangeAspect="1"/>
                     </pic:cNvPicPr>
@@ -28595,7 +28595,7 @@
               <a:graphicData uri="http://schemas.openxmlformats.org/drawingml/2006/picture">
                 <pic:pic>
                   <pic:nvPicPr>
-                    <pic:cNvPr descr="../assets/dict_data_main.png" id="122" name="Picture"/>
+                    <pic:cNvPr descr="../assets/系统管理/dict_data_main.png" id="122" name="Picture"/>
                     <pic:cNvPicPr>
                       <a:picLocks noChangeArrowheads="1" noChangeAspect="1"/>
                     </pic:cNvPicPr>
@@ -29710,7 +29710,7 @@
               <a:graphicData uri="http://schemas.openxmlformats.org/drawingml/2006/picture">
                 <pic:pic>
                   <pic:nvPicPr>
-                    <pic:cNvPr descr="../assets/dict_data_add_modal.png" id="126" name="Picture"/>
+                    <pic:cNvPr descr="../assets/系统管理/dict_data_add_modal.png" id="126" name="Picture"/>
                     <pic:cNvPicPr>
                       <a:picLocks noChangeArrowheads="1" noChangeAspect="1"/>
                     </pic:cNvPicPr>
@@ -30774,7 +30774,7 @@
               <a:graphicData uri="http://schemas.openxmlformats.org/drawingml/2006/picture">
                 <pic:pic>
                   <pic:nvPicPr>
-                    <pic:cNvPr descr="../assets/flow_参数设置.png" id="132" name="Picture"/>
+                    <pic:cNvPr descr="../assets/系统管理/flow_参数设置.png" id="132" name="Picture"/>
                     <pic:cNvPicPr>
                       <a:picLocks noChangeArrowheads="1" noChangeAspect="1"/>
                     </pic:cNvPicPr>
@@ -30967,7 +30967,7 @@
               <a:graphicData uri="http://schemas.openxmlformats.org/drawingml/2006/picture">
                 <pic:pic>
                   <pic:nvPicPr>
-                    <pic:cNvPr descr="../assets/config_main.png" id="137" name="Picture"/>
+                    <pic:cNvPr descr="../assets/系统管理/config_main.png" id="137" name="Picture"/>
                     <pic:cNvPicPr>
                       <a:picLocks noChangeArrowheads="1" noChangeAspect="1"/>
                     </pic:cNvPicPr>
@@ -32534,7 +32534,7 @@
               <a:graphicData uri="http://schemas.openxmlformats.org/drawingml/2006/picture">
                 <pic:pic>
                   <pic:nvPicPr>
-                    <pic:cNvPr descr="../assets/config_add_modal.png" id="141" name="Picture"/>
+                    <pic:cNvPr descr="../assets/系统管理/config_add_modal.png" id="141" name="Picture"/>
                     <pic:cNvPicPr>
                       <a:picLocks noChangeArrowheads="1" noChangeAspect="1"/>
                     </pic:cNvPicPr>
@@ -33291,7 +33291,7 @@
               <a:graphicData uri="http://schemas.openxmlformats.org/drawingml/2006/picture">
                 <pic:pic>
                   <pic:nvPicPr>
-                    <pic:cNvPr descr="../assets/flow_通知公告.png" id="147" name="Picture"/>
+                    <pic:cNvPr descr="../assets/系统管理/flow_通知公告.png" id="147" name="Picture"/>
                     <pic:cNvPicPr>
                       <a:picLocks noChangeArrowheads="1" noChangeAspect="1"/>
                     </pic:cNvPicPr>
@@ -33484,7 +33484,7 @@
               <a:graphicData uri="http://schemas.openxmlformats.org/drawingml/2006/picture">
                 <pic:pic>
                   <pic:nvPicPr>
-                    <pic:cNvPr descr="../assets/notice_main.png" id="152" name="Picture"/>
+                    <pic:cNvPr descr="../assets/系统管理/notice_main.png" id="152" name="Picture"/>
                     <pic:cNvPicPr>
                       <a:picLocks noChangeArrowheads="1" noChangeAspect="1"/>
                     </pic:cNvPicPr>
@@ -35027,7 +35027,7 @@
               <a:graphicData uri="http://schemas.openxmlformats.org/drawingml/2006/picture">
                 <pic:pic>
                   <pic:nvPicPr>
-                    <pic:cNvPr descr="../assets/notice_add_modal.png" id="156" name="Picture"/>
+                    <pic:cNvPr descr="../assets/系统管理/notice_add_modal.png" id="156" name="Picture"/>
                     <pic:cNvPicPr>
                       <a:picLocks noChangeArrowheads="1" noChangeAspect="1"/>
                     </pic:cNvPicPr>
@@ -35680,7 +35680,7 @@
               <a:graphicData uri="http://schemas.openxmlformats.org/drawingml/2006/picture">
                 <pic:pic>
                   <pic:nvPicPr>
-                    <pic:cNvPr descr="../assets/notice_details_modal.png" id="160" name="Picture"/>
+                    <pic:cNvPr descr="../assets/系统管理/notice_details_modal.png" id="160" name="Picture"/>
                     <pic:cNvPicPr>
                       <a:picLocks noChangeArrowheads="1" noChangeAspect="1"/>
                     </pic:cNvPicPr>

</xml_diff>